<commit_message>
docs: regenerate Word report with embedded screenshots
</commit_message>
<xml_diff>
--- a/docs/FSD_Assignment_1_Report.docx
+++ b/docs/FSD_Assignment_1_Report.docx
@@ -248,15 +248,56 @@
     </w:p>
     <w:p>
       <w:pPr>
-        <w:spacing w:before="160" w:after="160"/>
+        <w:spacing w:before="160" w:after="80"/>
+        <w:jc w:val="center"/>
+      </w:pPr>
+      <w:r>
+        <w:drawing>
+          <wp:inline xmlns:a="http://schemas.openxmlformats.org/drawingml/2006/main" xmlns:pic="http://schemas.openxmlformats.org/drawingml/2006/picture">
+            <wp:extent cx="5029200" cy="5029200"/>
+            <wp:docPr id="1" name="Picture 1"/>
+            <wp:cNvGraphicFramePr>
+              <a:graphicFrameLocks noChangeAspect="1"/>
+            </wp:cNvGraphicFramePr>
+            <a:graphic>
+              <a:graphicData uri="http://schemas.openxmlformats.org/drawingml/2006/picture">
+                <pic:pic>
+                  <pic:nvPicPr>
+                    <pic:cNvPr id="0" name="architecture_diagram.png"/>
+                    <pic:cNvPicPr/>
+                  </pic:nvPicPr>
+                  <pic:blipFill>
+                    <a:blip r:embed="rId9"/>
+                    <a:stretch>
+                      <a:fillRect/>
+                    </a:stretch>
+                  </pic:blipFill>
+                  <pic:spPr>
+                    <a:xfrm>
+                      <a:off x="0" y="0"/>
+                      <a:ext cx="5029200" cy="5029200"/>
+                    </a:xfrm>
+                    <a:prstGeom prst="rect"/>
+                  </pic:spPr>
+                </pic:pic>
+              </a:graphicData>
+            </a:graphic>
+          </wp:inline>
+        </w:drawing>
+      </w:r>
+    </w:p>
+    <w:p>
+      <w:pPr>
+        <w:spacing w:after="240"/>
         <w:jc w:val="center"/>
       </w:pPr>
       <w:r>
         <w:rPr>
           <w:i/>
-          <w:color w:val="888888"/>
+          <w:color w:val="666666"/>
+          <w:sz w:val="19"/>
         </w:rPr>
-        <w:t>[Image Placeholder: System Architecture (docs/screenshots/architecture_diagram.png)]</w:t>
+        <w:t>Figure: System Architecture</w:t>
       </w:r>
     </w:p>
     <w:p>
@@ -510,15 +551,56 @@
     </w:p>
     <w:p>
       <w:pPr>
-        <w:spacing w:before="160" w:after="160"/>
+        <w:spacing w:before="160" w:after="80"/>
+        <w:jc w:val="center"/>
+      </w:pPr>
+      <w:r>
+        <w:drawing>
+          <wp:inline xmlns:a="http://schemas.openxmlformats.org/drawingml/2006/main" xmlns:pic="http://schemas.openxmlformats.org/drawingml/2006/picture">
+            <wp:extent cx="5029200" cy="2492324"/>
+            <wp:docPr id="2" name="Picture 2"/>
+            <wp:cNvGraphicFramePr>
+              <a:graphicFrameLocks noChangeAspect="1"/>
+            </wp:cNvGraphicFramePr>
+            <a:graphic>
+              <a:graphicData uri="http://schemas.openxmlformats.org/drawingml/2006/picture">
+                <pic:pic>
+                  <pic:nvPicPr>
+                    <pic:cNvPr id="0" name="01-dashboard-overview.png"/>
+                    <pic:cNvPicPr/>
+                  </pic:nvPicPr>
+                  <pic:blipFill>
+                    <a:blip r:embed="rId10"/>
+                    <a:stretch>
+                      <a:fillRect/>
+                    </a:stretch>
+                  </pic:blipFill>
+                  <pic:spPr>
+                    <a:xfrm>
+                      <a:off x="0" y="0"/>
+                      <a:ext cx="5029200" cy="2492324"/>
+                    </a:xfrm>
+                    <a:prstGeom prst="rect"/>
+                  </pic:spPr>
+                </pic:pic>
+              </a:graphicData>
+            </a:graphic>
+          </wp:inline>
+        </w:drawing>
+      </w:r>
+    </w:p>
+    <w:p>
+      <w:pPr>
+        <w:spacing w:after="240"/>
         <w:jc w:val="center"/>
       </w:pPr>
       <w:r>
         <w:rPr>
           <w:i/>
-          <w:color w:val="888888"/>
+          <w:color w:val="666666"/>
+          <w:sz w:val="19"/>
         </w:rPr>
-        <w:t>[Image Placeholder: Insight.IO Dashboard Overview (docs/screenshots/01-dashboard-overview.png)]</w:t>
+        <w:t>Figure: Insight.IO Dashboard Overview</w:t>
       </w:r>
     </w:p>
     <w:p>
@@ -577,15 +659,56 @@
     </w:p>
     <w:p>
       <w:pPr>
-        <w:spacing w:before="160" w:after="160"/>
+        <w:spacing w:before="160" w:after="80"/>
+        <w:jc w:val="center"/>
+      </w:pPr>
+      <w:r>
+        <w:drawing>
+          <wp:inline xmlns:a="http://schemas.openxmlformats.org/drawingml/2006/main" xmlns:pic="http://schemas.openxmlformats.org/drawingml/2006/picture">
+            <wp:extent cx="5029200" cy="2573333"/>
+            <wp:docPr id="3" name="Picture 3"/>
+            <wp:cNvGraphicFramePr>
+              <a:graphicFrameLocks noChangeAspect="1"/>
+            </wp:cNvGraphicFramePr>
+            <a:graphic>
+              <a:graphicData uri="http://schemas.openxmlformats.org/drawingml/2006/picture">
+                <pic:pic>
+                  <pic:nvPicPr>
+                    <pic:cNvPr id="0" name="02-map-view.png"/>
+                    <pic:cNvPicPr/>
+                  </pic:nvPicPr>
+                  <pic:blipFill>
+                    <a:blip r:embed="rId11"/>
+                    <a:stretch>
+                      <a:fillRect/>
+                    </a:stretch>
+                  </pic:blipFill>
+                  <pic:spPr>
+                    <a:xfrm>
+                      <a:off x="0" y="0"/>
+                      <a:ext cx="5029200" cy="2573333"/>
+                    </a:xfrm>
+                    <a:prstGeom prst="rect"/>
+                  </pic:spPr>
+                </pic:pic>
+              </a:graphicData>
+            </a:graphic>
+          </wp:inline>
+        </w:drawing>
+      </w:r>
+    </w:p>
+    <w:p>
+      <w:pPr>
+        <w:spacing w:after="240"/>
         <w:jc w:val="center"/>
       </w:pPr>
       <w:r>
         <w:rPr>
           <w:i/>
-          <w:color w:val="888888"/>
+          <w:color w:val="666666"/>
+          <w:sz w:val="19"/>
         </w:rPr>
-        <w:t>[Image Placeholder: Occupancy Map View (docs/screenshots/02-map-view.png)]</w:t>
+        <w:t>Figure: Occupancy Map View</w:t>
       </w:r>
     </w:p>
     <w:p>
@@ -612,15 +735,56 @@
     </w:p>
     <w:p>
       <w:pPr>
-        <w:spacing w:before="160" w:after="160"/>
+        <w:spacing w:before="160" w:after="80"/>
+        <w:jc w:val="center"/>
+      </w:pPr>
+      <w:r>
+        <w:drawing>
+          <wp:inline xmlns:a="http://schemas.openxmlformats.org/drawingml/2006/main" xmlns:pic="http://schemas.openxmlformats.org/drawingml/2006/picture">
+            <wp:extent cx="5029200" cy="2494944"/>
+            <wp:docPr id="4" name="Picture 4"/>
+            <wp:cNvGraphicFramePr>
+              <a:graphicFrameLocks noChangeAspect="1"/>
+            </wp:cNvGraphicFramePr>
+            <a:graphic>
+              <a:graphicData uri="http://schemas.openxmlformats.org/drawingml/2006/picture">
+                <pic:pic>
+                  <pic:nvPicPr>
+                    <pic:cNvPr id="0" name="03-camera-view.png"/>
+                    <pic:cNvPicPr/>
+                  </pic:nvPicPr>
+                  <pic:blipFill>
+                    <a:blip r:embed="rId12"/>
+                    <a:stretch>
+                      <a:fillRect/>
+                    </a:stretch>
+                  </pic:blipFill>
+                  <pic:spPr>
+                    <a:xfrm>
+                      <a:off x="0" y="0"/>
+                      <a:ext cx="5029200" cy="2494944"/>
+                    </a:xfrm>
+                    <a:prstGeom prst="rect"/>
+                  </pic:spPr>
+                </pic:pic>
+              </a:graphicData>
+            </a:graphic>
+          </wp:inline>
+        </w:drawing>
+      </w:r>
+    </w:p>
+    <w:p>
+      <w:pPr>
+        <w:spacing w:after="240"/>
         <w:jc w:val="center"/>
       </w:pPr>
       <w:r>
         <w:rPr>
           <w:i/>
-          <w:color w:val="888888"/>
+          <w:color w:val="666666"/>
+          <w:sz w:val="19"/>
         </w:rPr>
-        <w:t>[Image Placeholder: Live Camera Feed (docs/screenshots/03-camera-view.png)]</w:t>
+        <w:t>Figure: Live Camera Feed</w:t>
       </w:r>
     </w:p>
     <w:p>
@@ -647,15 +811,56 @@
     </w:p>
     <w:p>
       <w:pPr>
-        <w:spacing w:before="160" w:after="160"/>
+        <w:spacing w:before="160" w:after="80"/>
+        <w:jc w:val="center"/>
+      </w:pPr>
+      <w:r>
+        <w:drawing>
+          <wp:inline xmlns:a="http://schemas.openxmlformats.org/drawingml/2006/main" xmlns:pic="http://schemas.openxmlformats.org/drawingml/2006/picture">
+            <wp:extent cx="5029200" cy="2473979"/>
+            <wp:docPr id="5" name="Picture 5"/>
+            <wp:cNvGraphicFramePr>
+              <a:graphicFrameLocks noChangeAspect="1"/>
+            </wp:cNvGraphicFramePr>
+            <a:graphic>
+              <a:graphicData uri="http://schemas.openxmlformats.org/drawingml/2006/picture">
+                <pic:pic>
+                  <pic:nvPicPr>
+                    <pic:cNvPr id="0" name="04-diagnostics-view.png"/>
+                    <pic:cNvPicPr/>
+                  </pic:nvPicPr>
+                  <pic:blipFill>
+                    <a:blip r:embed="rId13"/>
+                    <a:stretch>
+                      <a:fillRect/>
+                    </a:stretch>
+                  </pic:blipFill>
+                  <pic:spPr>
+                    <a:xfrm>
+                      <a:off x="0" y="0"/>
+                      <a:ext cx="5029200" cy="2473979"/>
+                    </a:xfrm>
+                    <a:prstGeom prst="rect"/>
+                  </pic:spPr>
+                </pic:pic>
+              </a:graphicData>
+            </a:graphic>
+          </wp:inline>
+        </w:drawing>
+      </w:r>
+    </w:p>
+    <w:p>
+      <w:pPr>
+        <w:spacing w:after="240"/>
         <w:jc w:val="center"/>
       </w:pPr>
       <w:r>
         <w:rPr>
           <w:i/>
-          <w:color w:val="888888"/>
+          <w:color w:val="666666"/>
+          <w:sz w:val="19"/>
         </w:rPr>
-        <w:t>[Image Placeholder: Hardware Diagnostics (docs/screenshots/04-diagnostics-view.png)]</w:t>
+        <w:t>Figure: Hardware Diagnostics</w:t>
       </w:r>
     </w:p>
     <w:p>
@@ -682,15 +887,56 @@
     </w:p>
     <w:p>
       <w:pPr>
-        <w:spacing w:before="160" w:after="160"/>
+        <w:spacing w:before="160" w:after="80"/>
+        <w:jc w:val="center"/>
+      </w:pPr>
+      <w:r>
+        <w:drawing>
+          <wp:inline xmlns:a="http://schemas.openxmlformats.org/drawingml/2006/main" xmlns:pic="http://schemas.openxmlformats.org/drawingml/2006/picture">
+            <wp:extent cx="5029200" cy="2468737"/>
+            <wp:docPr id="6" name="Picture 6"/>
+            <wp:cNvGraphicFramePr>
+              <a:graphicFrameLocks noChangeAspect="1"/>
+            </wp:cNvGraphicFramePr>
+            <a:graphic>
+              <a:graphicData uri="http://schemas.openxmlformats.org/drawingml/2006/picture">
+                <pic:pic>
+                  <pic:nvPicPr>
+                    <pic:cNvPr id="0" name="05-analytics-view.png"/>
+                    <pic:cNvPicPr/>
+                  </pic:nvPicPr>
+                  <pic:blipFill>
+                    <a:blip r:embed="rId14"/>
+                    <a:stretch>
+                      <a:fillRect/>
+                    </a:stretch>
+                  </pic:blipFill>
+                  <pic:spPr>
+                    <a:xfrm>
+                      <a:off x="0" y="0"/>
+                      <a:ext cx="5029200" cy="2468737"/>
+                    </a:xfrm>
+                    <a:prstGeom prst="rect"/>
+                  </pic:spPr>
+                </pic:pic>
+              </a:graphicData>
+            </a:graphic>
+          </wp:inline>
+        </w:drawing>
+      </w:r>
+    </w:p>
+    <w:p>
+      <w:pPr>
+        <w:spacing w:after="240"/>
         <w:jc w:val="center"/>
       </w:pPr>
       <w:r>
         <w:rPr>
           <w:i/>
-          <w:color w:val="888888"/>
+          <w:color w:val="666666"/>
+          <w:sz w:val="19"/>
         </w:rPr>
-        <w:t>[Image Placeholder: Telemetry Logs and Analytics (docs/screenshots/05-analytics-view.png)]</w:t>
+        <w:t>Figure: Telemetry Logs and Analytics</w:t>
       </w:r>
     </w:p>
     <w:p>
@@ -717,15 +963,56 @@
     </w:p>
     <w:p>
       <w:pPr>
-        <w:spacing w:before="160" w:after="160"/>
+        <w:spacing w:before="160" w:after="80"/>
+        <w:jc w:val="center"/>
+      </w:pPr>
+      <w:r>
+        <w:drawing>
+          <wp:inline xmlns:a="http://schemas.openxmlformats.org/drawingml/2006/main" xmlns:pic="http://schemas.openxmlformats.org/drawingml/2006/picture">
+            <wp:extent cx="5029200" cy="2508048"/>
+            <wp:docPr id="7" name="Picture 7"/>
+            <wp:cNvGraphicFramePr>
+              <a:graphicFrameLocks noChangeAspect="1"/>
+            </wp:cNvGraphicFramePr>
+            <a:graphic>
+              <a:graphicData uri="http://schemas.openxmlformats.org/drawingml/2006/picture">
+                <pic:pic>
+                  <pic:nvPicPr>
+                    <pic:cNvPr id="0" name="06-waypoints-view.png"/>
+                    <pic:cNvPicPr/>
+                  </pic:nvPicPr>
+                  <pic:blipFill>
+                    <a:blip r:embed="rId15"/>
+                    <a:stretch>
+                      <a:fillRect/>
+                    </a:stretch>
+                  </pic:blipFill>
+                  <pic:spPr>
+                    <a:xfrm>
+                      <a:off x="0" y="0"/>
+                      <a:ext cx="5029200" cy="2508048"/>
+                    </a:xfrm>
+                    <a:prstGeom prst="rect"/>
+                  </pic:spPr>
+                </pic:pic>
+              </a:graphicData>
+            </a:graphic>
+          </wp:inline>
+        </w:drawing>
+      </w:r>
+    </w:p>
+    <w:p>
+      <w:pPr>
+        <w:spacing w:after="240"/>
         <w:jc w:val="center"/>
       </w:pPr>
       <w:r>
         <w:rPr>
           <w:i/>
-          <w:color w:val="888888"/>
+          <w:color w:val="666666"/>
+          <w:sz w:val="19"/>
         </w:rPr>
-        <w:t>[Image Placeholder: Waypoint Routing (docs/screenshots/06-waypoints-view.png)]</w:t>
+        <w:t>Figure: Waypoint Routing</w:t>
       </w:r>
     </w:p>
     <w:p>

</xml_diff>